<commit_message>
Add change log and pinned requirements, rewrite README, update pipeline and evaluation outputs
</commit_message>
<xml_diff>
--- a/documents/Assignment 2.docx
+++ b/documents/Assignment 2.docx
@@ -14398,150 +14398,22 @@
           <w:szCs w:val="24"/>
           <w:lang w:eastAsia="en-US"/>
         </w:rPr>
-        <w:t>The system is designed to help PFES plan staff and resources, not to predict whether an individual will commit a crime or to target specific addresses or communities.</w:t>
+        <w:t>The system is designed to help PFES plan staff and resources. It is not designed to predict whether an individual will commit a crime or to target specific addresses or communities.</w:t>
       </w:r>
     </w:p>
     <w:p>
       <w:pPr>
         <w:spacing w:before="100" w:beforeAutospacing="1" w:after="100" w:afterAutospacing="1"/>
+      </w:pPr>
+      <w:r>
         <w:rPr>
           <w:rFonts w:ascii="Times New Roman" w:eastAsia="Times New Roman" w:hAnsi="Times New Roman"/>
           <w:sz w:val="24"/>
           <w:szCs w:val="24"/>
           <w:lang w:eastAsia="en-US"/>
         </w:rPr>
-      </w:pPr>
-      <w:r>
-        <w:rPr>
-          <w:rFonts w:ascii="Times New Roman" w:eastAsia="Times New Roman" w:hAnsi="Times New Roman"/>
-          <w:sz w:val="24"/>
-          <w:szCs w:val="24"/>
-          <w:lang w:eastAsia="en-US"/>
-        </w:rPr>
-        <w:t>To guard against over-policing and unfair regional targeting, the following design constraints are planned for the dashboard stage:</w:t>
-      </w:r>
-    </w:p>
-    <w:p>
-      <w:pPr>
-        <w:numPr>
-          <w:ilvl w:val="0"/>
-          <w:numId w:val="19"/>
-        </w:numPr>
-        <w:spacing w:before="100" w:beforeAutospacing="1" w:after="100" w:afterAutospacing="1"/>
-        <w:rPr>
-          <w:rFonts w:ascii="Times New Roman" w:eastAsia="Times New Roman" w:hAnsi="Times New Roman"/>
-          <w:sz w:val="24"/>
-          <w:szCs w:val="24"/>
-          <w:lang w:eastAsia="en-US"/>
-        </w:rPr>
-      </w:pPr>
-      <w:r>
-        <w:rPr>
-          <w:rFonts w:ascii="Times New Roman" w:eastAsia="Times New Roman" w:hAnsi="Times New Roman"/>
-          <w:sz w:val="24"/>
-          <w:szCs w:val="24"/>
-          <w:lang w:eastAsia="en-US"/>
-        </w:rPr>
-        <w:t>Forecasts at region-and-month level only — no suburb, address, or community-level predictions.</w:t>
-      </w:r>
-    </w:p>
-    <w:p>
-      <w:pPr>
-        <w:numPr>
-          <w:ilvl w:val="0"/>
-          <w:numId w:val="19"/>
-        </w:numPr>
-        <w:spacing w:before="100" w:beforeAutospacing="1" w:after="100" w:afterAutospacing="1"/>
-        <w:rPr>
-          <w:rFonts w:ascii="Times New Roman" w:eastAsia="Times New Roman" w:hAnsi="Times New Roman"/>
-          <w:sz w:val="24"/>
-          <w:szCs w:val="24"/>
-          <w:lang w:eastAsia="en-US"/>
-        </w:rPr>
-      </w:pPr>
-      <w:r>
-        <w:rPr>
-          <w:rFonts w:ascii="Times New Roman" w:eastAsia="Times New Roman" w:hAnsi="Times New Roman"/>
-          <w:sz w:val="24"/>
-          <w:szCs w:val="24"/>
-          <w:lang w:eastAsia="en-US"/>
-        </w:rPr>
-        <w:t>Every forecast displayed alongside an uncertainty range, so outputs read as probabilistic planning signals rather than guaranteed outcomes.</w:t>
-      </w:r>
-    </w:p>
-    <w:p>
-      <w:pPr>
-        <w:numPr>
-          <w:ilvl w:val="0"/>
-          <w:numId w:val="19"/>
-        </w:numPr>
-        <w:spacing w:before="100" w:beforeAutospacing="1" w:after="100" w:afterAutospacing="1"/>
-        <w:rPr>
-          <w:rFonts w:ascii="Times New Roman" w:eastAsia="Times New Roman" w:hAnsi="Times New Roman"/>
-          <w:sz w:val="24"/>
-          <w:szCs w:val="24"/>
-          <w:lang w:eastAsia="en-US"/>
-        </w:rPr>
-      </w:pPr>
-      <w:r>
-        <w:rPr>
-          <w:rFonts w:ascii="Times New Roman" w:eastAsia="Times New Roman" w:hAnsi="Times New Roman"/>
-          <w:sz w:val="24"/>
-          <w:szCs w:val="24"/>
-          <w:lang w:eastAsia="en-US"/>
-        </w:rPr>
-        <w:t>Assault counts below a suppression threshold masked to prevent identification of individuals in low-population areas.</w:t>
-      </w:r>
-    </w:p>
-    <w:p>
-      <w:pPr>
-        <w:numPr>
-          <w:ilvl w:val="0"/>
-          <w:numId w:val="19"/>
-        </w:numPr>
-        <w:spacing w:before="100" w:beforeAutospacing="1" w:after="100" w:afterAutospacing="1"/>
-        <w:rPr>
-          <w:rFonts w:ascii="Times New Roman" w:eastAsia="Times New Roman" w:hAnsi="Times New Roman"/>
-          <w:sz w:val="24"/>
-          <w:szCs w:val="24"/>
-          <w:lang w:eastAsia="en-US"/>
-        </w:rPr>
-      </w:pPr>
-      <w:r>
-        <w:rPr>
-          <w:rFonts w:ascii="Times New Roman" w:eastAsia="Times New Roman" w:hAnsi="Times New Roman"/>
-          <w:sz w:val="24"/>
-          <w:szCs w:val="24"/>
-          <w:lang w:eastAsia="en-US"/>
-        </w:rPr>
-        <w:t>No automated patrol recommendations — any operational response remains the judgment of PFES commanders, weighing forecasts alongside other intelligence.</w:t>
-      </w:r>
-    </w:p>
-    <w:p>
-      <w:pPr>
-        <w:spacing w:before="100" w:beforeAutospacing="1" w:after="100" w:afterAutospacing="1"/>
-        <w:rPr>
-          <w:rFonts w:ascii="Times New Roman" w:eastAsia="Times New Roman" w:hAnsi="Times New Roman"/>
-          <w:sz w:val="24"/>
-          <w:szCs w:val="24"/>
-          <w:lang w:eastAsia="en-US"/>
-        </w:rPr>
-      </w:pPr>
-      <w:r>
-        <w:rPr>
-          <w:rFonts w:ascii="Times New Roman" w:eastAsia="Times New Roman" w:hAnsi="Times New Roman"/>
-          <w:sz w:val="24"/>
-          <w:szCs w:val="24"/>
-          <w:lang w:eastAsia="en-US"/>
-        </w:rPr>
-        <w:t>These constraints will be enforced in code at the dashboard layer, rather than left to individual interpretation at the point of use, once that stage begins.</w:t>
-      </w:r>
-    </w:p>
-    <w:p>
-      <w:pPr>
-        <w:spacing w:before="120" w:after="160"/>
-        <w:jc w:val="both"/>
-      </w:pPr>
+        <w:t>Forecasts may not always be correct, so the dashboard will show uncertainty and explain the limitations of the data and model. This helps users avoid treating the predictions as exact results.</w:t>
+      </w:r>
     </w:p>
     <w:p>
       <w:pPr>
@@ -14647,7 +14519,7 @@
             <w:sz w:val="24"/>
             <w:szCs w:val="24"/>
           </w:rPr>
-          <w:t>https://hendrickdang.atlassian.net/jira/software/projects/SCRUM/boards/1/timeline?rangeMode=WEEKS</w:t>
+          <w:t>https://hendrickdang.atlassian.net/jira/software/projects/SCRUM/boards/1</w:t>
         </w:r>
       </w:hyperlink>
       <w:r>
@@ -16048,7 +15920,7 @@
                 <w:sz w:val="24"/>
                 <w:szCs w:val="24"/>
               </w:rPr>
-              <w:t>Analytics and Machine Learning stage: Forecast evaluation and benchmarking, defined the forecast task specification, validation design and leakage controls; built evaluation.py adding naive baselines, rolling-origin backtesting at four horizons and empirical prediction intervals; specified drift thresholds and retraining rules.</w:t>
+              <w:t>Analytics and Machine Learning: forecast task specification, validation design and leakage controls; built evaluation.py with naive baselines, rolling-origin backtesting and prediction intervals; set drift thresholds and retraining rules.</w:t>
             </w:r>
           </w:p>
         </w:tc>
@@ -16129,16 +16001,17 @@
       <w:tblPr>
         <w:tblStyle w:val="TableGrid"/>
         <w:tblW w:w="0" w:type="auto"/>
+        <w:tblLayout w:type="fixed"/>
         <w:tblLook w:val="04A0" w:firstRow="1" w:lastRow="0" w:firstColumn="1" w:lastColumn="0" w:noHBand="0" w:noVBand="1"/>
       </w:tblPr>
       <w:tblGrid>
-        <w:gridCol w:w="1071"/>
-        <w:gridCol w:w="7945"/>
+        <w:gridCol w:w="1413"/>
+        <w:gridCol w:w="7603"/>
       </w:tblGrid>
       <w:tr>
         <w:tc>
           <w:tcPr>
-            <w:tcW w:w="1150" w:type="dxa"/>
+            <w:tcW w:w="1413" w:type="dxa"/>
           </w:tcPr>
           <w:p>
             <w:pPr>
@@ -16165,7 +16038,7 @@
         </w:tc>
         <w:tc>
           <w:tcPr>
-            <w:tcW w:w="7866" w:type="dxa"/>
+            <w:tcW w:w="7603" w:type="dxa"/>
           </w:tcPr>
           <w:p>
             <w:pPr>
@@ -16194,7 +16067,7 @@
       <w:tr>
         <w:tc>
           <w:tcPr>
-            <w:tcW w:w="1150" w:type="dxa"/>
+            <w:tcW w:w="1413" w:type="dxa"/>
           </w:tcPr>
           <w:p>
             <w:pPr>
@@ -16221,7 +16094,7 @@
         </w:tc>
         <w:tc>
           <w:tcPr>
-            <w:tcW w:w="7866" w:type="dxa"/>
+            <w:tcW w:w="7603" w:type="dxa"/>
           </w:tcPr>
           <w:p>
             <w:pPr>
@@ -16251,7 +16124,7 @@
       <w:tr>
         <w:tc>
           <w:tcPr>
-            <w:tcW w:w="1150" w:type="dxa"/>
+            <w:tcW w:w="1413" w:type="dxa"/>
           </w:tcPr>
           <w:p>
             <w:pPr>
@@ -16278,7 +16151,7 @@
         </w:tc>
         <w:tc>
           <w:tcPr>
-            <w:tcW w:w="7866" w:type="dxa"/>
+            <w:tcW w:w="7603" w:type="dxa"/>
           </w:tcPr>
           <w:p>
             <w:pPr>
@@ -16308,7 +16181,7 @@
       <w:tr>
         <w:tc>
           <w:tcPr>
-            <w:tcW w:w="1150" w:type="dxa"/>
+            <w:tcW w:w="1413" w:type="dxa"/>
           </w:tcPr>
           <w:p>
             <w:pPr>
@@ -16347,7 +16220,7 @@
         </w:tc>
         <w:tc>
           <w:tcPr>
-            <w:tcW w:w="7866" w:type="dxa"/>
+            <w:tcW w:w="7603" w:type="dxa"/>
           </w:tcPr>
           <w:p>
             <w:pPr>
@@ -16376,7 +16249,7 @@
       <w:tr>
         <w:tc>
           <w:tcPr>
-            <w:tcW w:w="1150" w:type="dxa"/>
+            <w:tcW w:w="1413" w:type="dxa"/>
           </w:tcPr>
           <w:p>
             <w:pPr>
@@ -16415,7 +16288,7 @@
         </w:tc>
         <w:tc>
           <w:tcPr>
-            <w:tcW w:w="7866" w:type="dxa"/>
+            <w:tcW w:w="7603" w:type="dxa"/>
           </w:tcPr>
           <w:p>
             <w:pPr>
@@ -16453,7 +16326,7 @@
       <w:tr>
         <w:tc>
           <w:tcPr>
-            <w:tcW w:w="1150" w:type="dxa"/>
+            <w:tcW w:w="1413" w:type="dxa"/>
           </w:tcPr>
           <w:p>
             <w:pPr>
@@ -16474,14 +16347,13 @@
                 <w:sz w:val="24"/>
                 <w:szCs w:val="24"/>
               </w:rPr>
-              <w:lastRenderedPageBreak/>
               <w:t>Ingest and processing code</w:t>
             </w:r>
           </w:p>
         </w:tc>
         <w:tc>
           <w:tcPr>
-            <w:tcW w:w="7866" w:type="dxa"/>
+            <w:tcW w:w="7603" w:type="dxa"/>
           </w:tcPr>
           <w:p>
             <w:pPr>
@@ -22364,31 +22236,31 @@
         <w:rPr>
           <w:lang w:val="en-AU"/>
         </w:rPr>
-        <w:t>Four feature variants were compared using a baseline Linear Regression model, trained on 2015</w:t>
+        <w:t xml:space="preserve">Four feature variants were compared using a baseline Linear Regression model with TimeSeriesSplit cross-validation over the training period (2015-2022, 504 rows after lag warm-up), leaving the 2023-2025 test period untouched. Each feature combination was standardised inside the cross-validation folds and trained under identical conditions, allowing a controlled comparison of predictive performance. RMSE was used as the primary selection criterion, supported by MAE, due to its sensitivity to larger errors and its suitability for the log-transformed assault-rate target.</w:t>
       </w:r>
       <w:r>
         <w:rPr>
           <w:lang w:val="vi-VN"/>
         </w:rPr>
-        <w:t>-</w:t>
+        <w:t xml:space="preserve"/>
       </w:r>
       <w:r>
         <w:rPr>
           <w:lang w:val="en-AU"/>
         </w:rPr>
-        <w:t>2022 (504 rows) and tested on 2023</w:t>
+        <w:t xml:space="preserve"/>
       </w:r>
       <w:r>
         <w:rPr>
           <w:lang w:val="vi-VN"/>
         </w:rPr>
-        <w:t>-</w:t>
+        <w:t xml:space="preserve"/>
       </w:r>
       <w:r>
         <w:rPr>
           <w:lang w:val="en-AU"/>
         </w:rPr>
-        <w:t>2025 (192 rows) after lag warm-up. Each feature combination was standardised and trained under identical conditions, allowing a controlled comparison of predictive performance. RMSE was used as the primary selection criterion, supported by MAE, due to its sensitivity to larger errors and its suitability for the log-transformed assault-rate target.</w:t>
+        <w:t xml:space="preserve"/>
       </w:r>
     </w:p>
     <w:p>
@@ -23523,7 +23395,7 @@
           <w:noProof/>
         </w:rPr>
         <w:drawing>
-          <wp:inline distT="0" distB="0" distL="0" distR="0" wp14:anchorId="0418795F" wp14:editId="4A410684">
+          <wp:inline distT="0" distB="0" distL="0" distR="0" wp14:anchorId="0418795F" wp14:editId="59C4CBDE">
             <wp:extent cx="5731510" cy="1908175"/>
             <wp:effectExtent l="0" t="0" r="2540" b="0"/>
             <wp:docPr id="2004789128" name="Picture 2"/>
@@ -38160,7 +38032,7 @@
           <w:sz w:val="24"/>
           <w:szCs w:val="24"/>
         </w:rPr>
-        <w:t>A model comparison only means something against a benchmark. Assessment 1 compared regression models against each other; once a 12-month moving average was added, it beat every model at every horizon. Reporting that was less comfortable than reporting a win, but more defensible. The second lesson was leakage: both cases I found produced plausible output, which is why they were easy to miss.</w:t>
+        <w:t xml:space="preserve">A model comparison only means something against a benchmark. Assessment 1 compared regression models against each other; once naive baselines were added, a 12-month moving average beat every model from three months out, and XGBoost only won at one month. Reporting a split result was less comfortable than reporting a single winner, but more defensible. The second lesson was leakage: every case I found produced plausible output, which is why they were easy to miss.</w:t>
       </w:r>
       <w:r>
         <w:rPr>
@@ -42508,6 +42380,10 @@
 </file>
 
 <file path=customXml/item1.xml><?xml version="1.0" encoding="utf-8"?>
+<b:Sources xmlns:b="http://schemas.openxmlformats.org/officeDocument/2006/bibliography" xmlns="http://schemas.openxmlformats.org/officeDocument/2006/bibliography" SelectedStyle="\APASixthEditionOfficeOnline.xsl" StyleName="APA" Version="6"/>
+</file>
+
+<file path=customXml/item2.xml><?xml version="1.0" encoding="utf-8"?>
 <?mso-contentType ?>
 <FormTemplates xmlns="http://schemas.microsoft.com/sharepoint/v3/contenttype/forms">
   <Display>DocumentLibraryForm</Display>
@@ -42516,7 +42392,7 @@
 </FormTemplates>
 </file>
 
-<file path=customXml/item2.xml><?xml version="1.0" encoding="utf-8"?>
+<file path=customXml/item3.xml><?xml version="1.0" encoding="utf-8"?>
 <ct:contentTypeSchema xmlns:ct="http://schemas.microsoft.com/office/2006/metadata/contentType" xmlns:ma="http://schemas.microsoft.com/office/2006/metadata/properties/metaAttributes" ct:_="" ma:_="" ma:contentTypeName="Document" ma:contentTypeID="0x010100922A3CA1EE6E4B44833A16005451862E" ma:contentTypeVersion="3" ma:contentTypeDescription="Create a new document." ma:contentTypeScope="" ma:versionID="b712dade4bf8bf57d4a0cdac4d020ae4">
   <xsd:schema xmlns:xsd="http://www.w3.org/2001/XMLSchema" xmlns:xs="http://www.w3.org/2001/XMLSchema" xmlns:p="http://schemas.microsoft.com/office/2006/metadata/properties" xmlns:ns2="92f6da62-8f25-40d3-824c-47c5f6f94bd6" targetNamespace="http://schemas.microsoft.com/office/2006/metadata/properties" ma:root="true" ma:fieldsID="f6f8642a0533a95cbf7fc7bbc8c1e153" ns2:_="">
     <xsd:import namespace="92f6da62-8f25-40d3-824c-47c5f6f94bd6"/>
@@ -42654,10 +42530,6 @@
 </ct:contentTypeSchema>
 </file>
 
-<file path=customXml/item3.xml><?xml version="1.0" encoding="utf-8"?>
-<b:Sources xmlns:b="http://schemas.openxmlformats.org/officeDocument/2006/bibliography" xmlns="http://schemas.openxmlformats.org/officeDocument/2006/bibliography" SelectedStyle="\APASixthEditionOfficeOnline.xsl" StyleName="APA" Version="6"/>
-</file>
-
 <file path=customXml/item4.xml><?xml version="1.0" encoding="utf-8"?>
 <p:properties xmlns:p="http://schemas.microsoft.com/office/2006/metadata/properties" xmlns:xsi="http://www.w3.org/2001/XMLSchema-instance" xmlns:pc="http://schemas.microsoft.com/office/infopath/2007/PartnerControls">
   <documentManagement/>
@@ -42665,6 +42537,14 @@
 </file>
 
 <file path=customXml/itemProps1.xml><?xml version="1.0" encoding="utf-8"?>
+<ds:datastoreItem xmlns:ds="http://schemas.openxmlformats.org/officeDocument/2006/customXml" ds:itemID="{E3DA75CE-018A-4AF1-8B5C-BF0FBFE76924}">
+  <ds:schemaRefs>
+    <ds:schemaRef ds:uri="http://schemas.openxmlformats.org/officeDocument/2006/bibliography"/>
+  </ds:schemaRefs>
+</ds:datastoreItem>
+</file>
+
+<file path=customXml/itemProps2.xml><?xml version="1.0" encoding="utf-8"?>
 <ds:datastoreItem xmlns:ds="http://schemas.openxmlformats.org/officeDocument/2006/customXml" ds:itemID="{82A9BB68-56B4-4822-B6B7-DB471576EB1F}">
   <ds:schemaRefs>
     <ds:schemaRef ds:uri="http://schemas.microsoft.com/sharepoint/v3/contenttype/forms"/>
@@ -42672,7 +42552,7 @@
 </ds:datastoreItem>
 </file>
 
-<file path=customXml/itemProps2.xml><?xml version="1.0" encoding="utf-8"?>
+<file path=customXml/itemProps3.xml><?xml version="1.0" encoding="utf-8"?>
 <ds:datastoreItem xmlns:ds="http://schemas.openxmlformats.org/officeDocument/2006/customXml" ds:itemID="{69960CE0-24F5-4ADF-A12F-FE193FFA9C43}">
   <ds:schemaRefs>
     <ds:schemaRef ds:uri="http://schemas.microsoft.com/office/2006/metadata/contentType"/>
@@ -42690,14 +42570,6 @@
 </ds:datastoreItem>
 </file>
 
-<file path=customXml/itemProps3.xml><?xml version="1.0" encoding="utf-8"?>
-<ds:datastoreItem xmlns:ds="http://schemas.openxmlformats.org/officeDocument/2006/customXml" ds:itemID="{E3DA75CE-018A-4AF1-8B5C-BF0FBFE76924}">
-  <ds:schemaRefs>
-    <ds:schemaRef ds:uri="http://schemas.openxmlformats.org/officeDocument/2006/bibliography"/>
-  </ds:schemaRefs>
-</ds:datastoreItem>
-</file>
-
 <file path=customXml/itemProps4.xml><?xml version="1.0" encoding="utf-8"?>
 <ds:datastoreItem xmlns:ds="http://schemas.openxmlformats.org/officeDocument/2006/customXml" ds:itemID="{B2E31085-3E06-4A9F-9730-20A04C85DF24}">
   <ds:schemaRefs>

</xml_diff>